<commit_message>
Update resume portfolio link
</commit_message>
<xml_diff>
--- a/assets/Collins_Culbert_Resume.docx
+++ b/assets/Collins_Culbert_Resume.docx
@@ -58,6 +58,27 @@
             <w:u w:val="single"/>
           </w:rPr>
           <w:t xml:space="preserve">LinkedIn</w:t>
+        </w:r>
+      </w:hyperlink>
+      <w:r>
+        <w:rPr>
+          <w:rFonts w:ascii="Arial" w:cs="Arial" w:eastAsia="Arial" w:hAnsi="Arial"/>
+          <w:color w:val="4A4A4A"/>
+          <w:sz w:val="18"/>
+          <w:szCs w:val="18"/>
+        </w:rPr>
+        <w:t xml:space="preserve"> · </w:t>
+      </w:r>
+      <w:hyperlink w:history="1" r:id="rIdPortfolio">
+        <w:r>
+          <w:rPr>
+            <w:rFonts w:ascii="Arial" w:cs="Arial" w:eastAsia="Arial" w:hAnsi="Arial"/>
+            <w:color w:val="1155CC"/>
+            <w:sz w:val="18"/>
+            <w:szCs w:val="18"/>
+            <w:u w:val="single"/>
+          </w:rPr>
+          <w:t xml:space="preserve">Portfolio</w:t>
         </w:r>
       </w:hyperlink>
     </w:p>

</xml_diff>

<commit_message>
Swap POS systems for Oracle, add SolidWorks
</commit_message>
<xml_diff>
--- a/assets/Collins_Culbert_Resume.docx
+++ b/assets/Collins_Culbert_Resume.docx
@@ -78,7 +78,7 @@
         </w:rPr>
         <w:t xml:space="preserve">   •   </w:t>
       </w:r>
-      <w:hyperlink w:history="1" r:id="rIdh3uc2djvjlqqbq-gjb8xu">
+      <w:hyperlink w:history="1" r:id="rIduhbmd74zlf51ll4tajwk-">
         <w:r>
           <w:rPr>
             <w:rFonts w:ascii="Inter" w:cs="Inter" w:eastAsia="Inter" w:hAnsi="Inter"/>
@@ -99,7 +99,7 @@
         </w:rPr>
         <w:t xml:space="preserve">   •   </w:t>
       </w:r>
-      <w:hyperlink w:history="1" r:id="rIdjaysv_1ywy1rdcifkeldi">
+      <w:hyperlink w:history="1" r:id="rIdxkbo8exjf8yawpe8psls3">
         <w:r>
           <w:rPr>
             <w:rFonts w:ascii="Inter" w:cs="Inter" w:eastAsia="Inter" w:hAnsi="Inter"/>
@@ -120,7 +120,7 @@
         </w:rPr>
         <w:t xml:space="preserve">   •   </w:t>
       </w:r>
-      <w:hyperlink w:history="1" r:id="rIdllqu9pq9xorjq6ctowq21">
+      <w:hyperlink w:history="1" r:id="rIdf_efis7rqv140sanc0ssb">
         <w:r>
           <w:rPr>
             <w:rFonts w:ascii="Inter" w:cs="Inter" w:eastAsia="Inter" w:hAnsi="Inter"/>
@@ -288,7 +288,7 @@
           <w:sz w:val="19"/>
           <w:szCs w:val="19"/>
         </w:rPr>
-        <w:t xml:space="preserve">STM32F4xx / Keil uVision, Quartus Prime (FPGA/DE10), KiCad, oscilloscopes, multimeters, DC motor drivers</w:t>
+        <w:t xml:space="preserve">STM32F4xx / Keil uVision, Quartus Prime (FPGA/DE10), KiCad, SolidWorks, oscilloscopes, multimeters, DC motor drivers</w:t>
       </w:r>
     </w:p>
     <w:p>
@@ -352,7 +352,7 @@
           <w:sz w:val="19"/>
           <w:szCs w:val="19"/>
         </w:rPr>
-        <w:t xml:space="preserve">MS Office Suite, POS systems, HubSpot (basics)</w:t>
+        <w:t xml:space="preserve">MS Office Suite, Oracle, HubSpot (basics)</w:t>
       </w:r>
     </w:p>
     <w:p>

</xml_diff>

<commit_message>
Add MATLAB to programming skills
</commit_message>
<xml_diff>
--- a/assets/Collins_Culbert_Resume.docx
+++ b/assets/Collins_Culbert_Resume.docx
@@ -78,7 +78,7 @@
         </w:rPr>
         <w:t xml:space="preserve">   •   </w:t>
       </w:r>
-      <w:hyperlink w:history="1" r:id="rIduhbmd74zlf51ll4tajwk-">
+      <w:hyperlink w:history="1" r:id="rIdmezyf3md4otr6chsekolc">
         <w:r>
           <w:rPr>
             <w:rFonts w:ascii="Inter" w:cs="Inter" w:eastAsia="Inter" w:hAnsi="Inter"/>
@@ -99,7 +99,7 @@
         </w:rPr>
         <w:t xml:space="preserve">   •   </w:t>
       </w:r>
-      <w:hyperlink w:history="1" r:id="rIdxkbo8exjf8yawpe8psls3">
+      <w:hyperlink w:history="1" r:id="rIdm8sm0b9uh6pvu5gacfn6v">
         <w:r>
           <w:rPr>
             <w:rFonts w:ascii="Inter" w:cs="Inter" w:eastAsia="Inter" w:hAnsi="Inter"/>
@@ -120,7 +120,7 @@
         </w:rPr>
         <w:t xml:space="preserve">   •   </w:t>
       </w:r>
-      <w:hyperlink w:history="1" r:id="rIdf_efis7rqv140sanc0ssb">
+      <w:hyperlink w:history="1" r:id="rIdrecgjzs5wsqkuqqter80o">
         <w:r>
           <w:rPr>
             <w:rFonts w:ascii="Inter" w:cs="Inter" w:eastAsia="Inter" w:hAnsi="Inter"/>
@@ -256,7 +256,7 @@
           <w:sz w:val="19"/>
           <w:szCs w:val="19"/>
         </w:rPr>
-        <w:t xml:space="preserve">Python, SQL, C/C++ (STM32 bare metal), MicroPython, JavaScript, HTML/CSS</w:t>
+        <w:t xml:space="preserve">Python, SQL, C/C++ (STM32 bare metal), MicroPython, JavaScript, HTML/CSS, MATLAB</w:t>
       </w:r>
     </w:p>
     <w:p>

</xml_diff>

<commit_message>
Shorten header links to LinkedIn / Portfolio labels
</commit_message>
<xml_diff>
--- a/assets/Collins_Culbert_Resume.docx
+++ b/assets/Collins_Culbert_Resume.docx
@@ -78,7 +78,7 @@
         </w:rPr>
         <w:t xml:space="preserve">   •   </w:t>
       </w:r>
-      <w:hyperlink w:history="1" r:id="rIdmezyf3md4otr6chsekolc">
+      <w:hyperlink w:history="1" r:id="rId9-dol49xvkgls2p3sjjrq">
         <w:r>
           <w:rPr>
             <w:rFonts w:ascii="Inter" w:cs="Inter" w:eastAsia="Inter" w:hAnsi="Inter"/>
@@ -99,7 +99,7 @@
         </w:rPr>
         <w:t xml:space="preserve">   •   </w:t>
       </w:r>
-      <w:hyperlink w:history="1" r:id="rIdm8sm0b9uh6pvu5gacfn6v">
+      <w:hyperlink w:history="1" r:id="rIdl8tfvfbwgnlxgzin2t6-y">
         <w:r>
           <w:rPr>
             <w:rFonts w:ascii="Inter" w:cs="Inter" w:eastAsia="Inter" w:hAnsi="Inter"/>
@@ -108,7 +108,7 @@
             <w:szCs w:val="17"/>
             <w:u w:val="none"/>
           </w:rPr>
-          <w:t xml:space="preserve">linkedin.com/in/collinsculbert</w:t>
+          <w:t xml:space="preserve">LinkedIn</w:t>
         </w:r>
       </w:hyperlink>
       <w:r>
@@ -120,7 +120,7 @@
         </w:rPr>
         <w:t xml:space="preserve">   •   </w:t>
       </w:r>
-      <w:hyperlink w:history="1" r:id="rIdrecgjzs5wsqkuqqter80o">
+      <w:hyperlink w:history="1" r:id="rIdc1aekwbsbywskmxaad4rw">
         <w:r>
           <w:rPr>
             <w:rFonts w:ascii="Inter" w:cs="Inter" w:eastAsia="Inter" w:hAnsi="Inter"/>
@@ -129,7 +129,7 @@
             <w:szCs w:val="17"/>
             <w:u w:val="none"/>
           </w:rPr>
-          <w:t xml:space="preserve">aulsz-port.vercel.app</w:t>
+          <w:t xml:space="preserve">Portfolio</w:t>
         </w:r>
       </w:hyperlink>
     </w:p>

</xml_diff>

<commit_message>
add open source contributions section (tflite-micro, Zephyr, emlearn) to resume + site
</commit_message>
<xml_diff>
--- a/assets/Collins_Culbert_Resume.docx
+++ b/assets/Collins_Culbert_Resume.docx
@@ -1,5 +1,27 @@
 
-<file path=word/document.xml><?xml version="1.0" encoding="utf-8"?>
+<file path=docProps\app.xml><?xml version="1.0" encoding="utf-8"?>
+<Properties xmlns="http://schemas.openxmlformats.org/officeDocument/2006/extended-properties" xmlns:vt="http://schemas.openxmlformats.org/officeDocument/2006/docPropsVTypes"/>
+</file>
+
+<file path=docProps\core.xml><?xml version="1.0" encoding="utf-8"?>
+<cp:coreProperties xmlns:cp="http://schemas.openxmlformats.org/package/2006/metadata/core-properties" xmlns:dc="http://purl.org/dc/elements/1.1/" xmlns:dcterms="http://purl.org/dc/terms/" xmlns:dcmitype="http://purl.org/dc/dcmitype/" xmlns:xsi="http://www.w3.org/2001/XMLSchema-instance">
+  <dc:creator>Un-named</dc:creator>
+  <cp:lastModifiedBy>Un-named</cp:lastModifiedBy>
+  <cp:revision>1</cp:revision>
+  <dcterms:created xsi:type="dcterms:W3CDTF">2026-07-13T06:05:32.858Z</dcterms:created>
+  <dcterms:modified xsi:type="dcterms:W3CDTF">2026-07-13T06:05:32.858Z</dcterms:modified>
+</cp:coreProperties>
+</file>
+
+<file path=docProps\custom.xml><?xml version="1.0" encoding="utf-8"?>
+<Properties xmlns="http://schemas.openxmlformats.org/officeDocument/2006/custom-properties" xmlns:vt="http://schemas.openxmlformats.org/officeDocument/2006/docPropsVTypes"/>
+</file>
+
+<file path=word\comments.xml><?xml version="1.0" encoding="utf-8"?>
+<w:comments xmlns:cx="http://schemas.microsoft.com/office/drawing/2014/chartex" xmlns:cx1="http://schemas.microsoft.com/office/drawing/2015/9/8/chartex" xmlns:cx2="http://schemas.microsoft.com/office/drawing/2015/10/21/chartex" xmlns:cx3="http://schemas.microsoft.com/office/drawing/2016/5/9/chartex" xmlns:cx4="http://schemas.microsoft.com/office/drawing/2016/5/10/chartex" xmlns:cx5="http://schemas.microsoft.com/office/drawing/2016/5/11/chartex" xmlns:cx6="http://schemas.microsoft.com/office/drawing/2016/5/12/chartex" xmlns:cx7="http://schemas.microsoft.com/office/drawing/2016/5/13/chartex" xmlns:cx8="http://schemas.microsoft.com/office/drawing/2016/5/14/chartex" xmlns:mc="http://schemas.openxmlformats.org/markup-compatibility/2006" xmlns:aink="http://schemas.microsoft.com/office/drawing/2016/ink" xmlns:am3d="http://schemas.microsoft.com/office/drawing/2017/model3d" xmlns:o="urn:schemas-microsoft-com:office:office" xmlns:r="http://schemas.openxmlformats.org/officeDocument/2006/relationships" xmlns:m="http://schemas.openxmlformats.org/officeDocument/2006/math" xmlns:v="urn:schemas-microsoft-com:vml" xmlns:wp14="http://schemas.microsoft.com/office/word/2010/wordprocessingDrawing" xmlns:wp="http://schemas.openxmlformats.org/drawingml/2006/wordprocessingDrawing" xmlns:w10="urn:schemas-microsoft-com:office:word" xmlns:w="http://schemas.openxmlformats.org/wordprocessingml/2006/main" xmlns:w14="http://schemas.microsoft.com/office/word/2010/wordml" xmlns:w15="http://schemas.microsoft.com/office/word/2012/wordml" xmlns:w16cex="http://schemas.microsoft.com/office/word/2018/wordml/cex" xmlns:w16cid="http://schemas.microsoft.com/office/word/2016/wordml/cid" xmlns:w16="http://schemas.microsoft.com/office/word/2018/wordml" xmlns:w16sdtdh="http://schemas.microsoft.com/office/word/2020/wordml/sdtdatahash" xmlns:w16se="http://schemas.microsoft.com/office/word/2015/wordml/symex" xmlns:wpg="http://schemas.microsoft.com/office/word/2010/wordprocessingGroup" xmlns:wpi="http://schemas.microsoft.com/office/word/2010/wordprocessingInk" xmlns:wne="http://schemas.microsoft.com/office/word/2006/wordml" xmlns:wps="http://schemas.microsoft.com/office/word/2010/wordprocessingShape"/>
+</file>
+
+<file path=word\document.xml><?xml version="1.0" encoding="utf-8"?>
 <w:document xmlns:wpc="http://schemas.microsoft.com/office/word/2010/wordprocessingCanvas" xmlns:mc="http://schemas.openxmlformats.org/markup-compatibility/2006" xmlns:o="urn:schemas-microsoft-com:office:office" xmlns:r="http://schemas.openxmlformats.org/officeDocument/2006/relationships" xmlns:m="http://schemas.openxmlformats.org/officeDocument/2006/math" xmlns:v="urn:schemas-microsoft-com:vml" xmlns:wp14="http://schemas.microsoft.com/office/word/2010/wordprocessingDrawing" xmlns:wp="http://schemas.openxmlformats.org/drawingml/2006/wordprocessingDrawing" xmlns:w10="urn:schemas-microsoft-com:office:word" xmlns:w="http://schemas.openxmlformats.org/wordprocessingml/2006/main" xmlns:w14="http://schemas.microsoft.com/office/word/2010/wordml" xmlns:w15="http://schemas.microsoft.com/office/word/2012/wordml" xmlns:wpg="http://schemas.microsoft.com/office/word/2010/wordprocessingGroup" xmlns:wpi="http://schemas.microsoft.com/office/word/2010/wordprocessingInk" xmlns:wne="http://schemas.microsoft.com/office/word/2006/wordml" xmlns:wps="http://schemas.microsoft.com/office/word/2010/wordprocessingShape" xmlns:cx="http://schemas.microsoft.com/office/drawing/2014/chartex" xmlns:cx1="http://schemas.microsoft.com/office/drawing/2015/9/8/chartex" xmlns:cx2="http://schemas.microsoft.com/office/drawing/2015/10/21/chartex" xmlns:cx3="http://schemas.microsoft.com/office/drawing/2016/5/9/chartex" xmlns:cx4="http://schemas.microsoft.com/office/drawing/2016/5/10/chartex" xmlns:cx5="http://schemas.microsoft.com/office/drawing/2016/5/11/chartex" xmlns:cx6="http://schemas.microsoft.com/office/drawing/2016/5/12/chartex" xmlns:cx7="http://schemas.microsoft.com/office/drawing/2016/5/13/chartex" xmlns:cx8="http://schemas.microsoft.com/office/drawing/2016/5/14/chartex" xmlns:aink="http://schemas.microsoft.com/office/drawing/2016/ink" xmlns:am3d="http://schemas.microsoft.com/office/drawing/2017/model3d" xmlns:w16cex="http://schemas.microsoft.com/office/word/2018/wordml/cex" xmlns:w16cid="http://schemas.microsoft.com/office/word/2016/wordml/cid" xmlns:w16="http://schemas.microsoft.com/office/word/2018/wordml" xmlns:w16sdtdh="http://schemas.microsoft.com/office/word/2020/wordml/sdtdatahash" xmlns:w16se="http://schemas.microsoft.com/office/word/2015/wordml/symex" mc:Ignorable="w14 w15 wp14">
   <w:body>
     <w:p>
@@ -993,6 +1015,171 @@
           <w:sz w:val="18"/>
           <w:szCs w:val="18"/>
         </w:rPr>
+        <w:t xml:space="preserve">OPEN SOURCE CONTRIBUTIONS</w:t>
+      </w:r>
+    </w:p>
+    <w:p>
+      <w:pPr>
+        <w:tabs>
+          <w:tab w:val="right" w:pos="10760"/>
+        </w:tabs>
+        <w:spacing w:after="20" w:before="100"/>
+      </w:pPr>
+      <w:r>
+        <w:rPr>
+          <w:rFonts w:ascii="Inter" w:cs="Inter" w:eastAsia="Inter" w:hAnsi="Inter"/>
+          <w:b/>
+          <w:bCs/>
+          <w:color w:val="17191B"/>
+          <w:sz w:val="20"/>
+          <w:szCs w:val="20"/>
+        </w:rPr>
+        <w:t xml:space="preserve">Open Source Contributor</w:t>
+      </w:r>
+      <w:r>
+        <w:rPr>
+          <w:rFonts w:ascii="Inter" w:cs="Inter" w:eastAsia="Inter" w:hAnsi="Inter"/>
+          <w:color w:val="17191B"/>
+          <w:sz w:val="20"/>
+          <w:szCs w:val="20"/>
+        </w:rPr>
+        <w:t xml:space="preserve"> | tensorflow/tflite-micro, Zephyr RTOS &amp; emlearn | Remote · 2025 – 2026</w:t>
+      </w:r>
+    </w:p>
+    <w:p>
+      <w:pPr>
+        <w:pStyle w:val="ListParagraph"/>
+        <w:numPr>
+          <w:ilvl w:val="0"/>
+          <w:numId w:val="2"/>
+        </w:numPr>
+        <w:spacing w:after="44" w:before="0"/>
+      </w:pPr>
+      <w:r>
+        <w:rPr>
+          <w:rFonts w:ascii="Inter" w:cs="Inter" w:eastAsia="Inter" w:hAnsi="Inter"/>
+          <w:color w:val="17191B"/>
+          <w:sz w:val="19"/>
+          <w:szCs w:val="19"/>
+        </w:rPr>
+        <w:t xml:space="preserve">Merged fixes into </w:t>
+      </w:r>
+      <w:r>
+        <w:rPr>
+          <w:rFonts w:ascii="Inter" w:cs="Inter" w:eastAsia="Inter" w:hAnsi="Inter"/>
+          <w:b/>
+          <w:bCs/>
+          <w:color w:val="17191B"/>
+          <w:sz w:val="19"/>
+          <w:szCs w:val="19"/>
+        </w:rPr>
+        <w:t xml:space="preserve">tensorflow/tflite-micro</w:t>
+      </w:r>
+      <w:r>
+        <w:rPr>
+          <w:rFonts w:ascii="Inter" w:cs="Inter" w:eastAsia="Inter" w:hAnsi="Inter"/>
+          <w:color w:val="17191B"/>
+          <w:sz w:val="19"/>
+          <w:szCs w:val="19"/>
+        </w:rPr>
+        <w:t xml:space="preserve"> core inference headers; changes accepted and synced via Google’s Copybara pipeline.</w:t>
+      </w:r>
+    </w:p>
+    <w:p>
+      <w:pPr>
+        <w:pStyle w:val="ListParagraph"/>
+        <w:numPr>
+          <w:ilvl w:val="0"/>
+          <w:numId w:val="2"/>
+        </w:numPr>
+        <w:spacing w:after="44" w:before="0"/>
+      </w:pPr>
+      <w:r>
+        <w:rPr>
+          <w:rFonts w:ascii="Inter" w:cs="Inter" w:eastAsia="Inter" w:hAnsi="Inter"/>
+          <w:color w:val="17191B"/>
+          <w:sz w:val="19"/>
+          <w:szCs w:val="19"/>
+        </w:rPr>
+        <w:t xml:space="preserve">Submitted a driver improvement PR to the </w:t>
+      </w:r>
+      <w:r>
+        <w:rPr>
+          <w:rFonts w:ascii="Inter" w:cs="Inter" w:eastAsia="Inter" w:hAnsi="Inter"/>
+          <w:b/>
+          <w:bCs/>
+          <w:color w:val="17191B"/>
+          <w:sz w:val="19"/>
+          <w:szCs w:val="19"/>
+        </w:rPr>
+        <w:t xml:space="preserve">Zephyr RTOS</w:t>
+      </w:r>
+      <w:r>
+        <w:rPr>
+          <w:rFonts w:ascii="Inter" w:cs="Inter" w:eastAsia="Inter" w:hAnsi="Inter"/>
+          <w:color w:val="17191B"/>
+          <w:sz w:val="19"/>
+          <w:szCs w:val="19"/>
+        </w:rPr>
+        <w:t xml:space="preserve"> kernel (PR #112671); reviewed and accepted by maintainers.</w:t>
+      </w:r>
+    </w:p>
+    <w:p>
+      <w:pPr>
+        <w:pStyle w:val="ListParagraph"/>
+        <w:numPr>
+          <w:ilvl w:val="0"/>
+          <w:numId w:val="2"/>
+        </w:numPr>
+        <w:spacing w:after="44" w:before="0"/>
+      </w:pPr>
+      <w:r>
+        <w:rPr>
+          <w:rFonts w:ascii="Inter" w:cs="Inter" w:eastAsia="Inter" w:hAnsi="Inter"/>
+          <w:color w:val="17191B"/>
+          <w:sz w:val="19"/>
+          <w:szCs w:val="19"/>
+        </w:rPr>
+        <w:t xml:space="preserve">Documented a Zephyr RTOS motion-classification example for </w:t>
+      </w:r>
+      <w:r>
+        <w:rPr>
+          <w:rFonts w:ascii="Inter" w:cs="Inter" w:eastAsia="Inter" w:hAnsi="Inter"/>
+          <w:b/>
+          <w:bCs/>
+          <w:color w:val="17191B"/>
+          <w:sz w:val="19"/>
+          <w:szCs w:val="19"/>
+        </w:rPr>
+        <w:t xml:space="preserve">emlearn</w:t>
+      </w:r>
+      <w:r>
+        <w:rPr>
+          <w:rFonts w:ascii="Inter" w:cs="Inter" w:eastAsia="Inter" w:hAnsi="Inter"/>
+          <w:color w:val="17191B"/>
+          <w:sz w:val="19"/>
+          <w:szCs w:val="19"/>
+        </w:rPr>
+        <w:t xml:space="preserve"> (C ML inference for microcontrollers; PR #124); merged by maintainers.</w:t>
+      </w:r>
+    </w:p>
+    <w:p>
+      <w:pPr>
+        <w:pBdr>
+          <w:bottom w:val="single" w:color="0C7A75" w:sz="6" w:space="4"/>
+        </w:pBdr>
+        <w:spacing w:after="100" w:before="240"/>
+      </w:pPr>
+      <w:r>
+        <w:rPr>
+          <w:rFonts w:ascii="Inter" w:cs="Inter" w:eastAsia="Inter" w:hAnsi="Inter"/>
+          <w:b/>
+          <w:bCs/>
+          <w:color w:val="0C7A75"/>
+          <w:spacing w:val="26"/>
+          <w:sz w:val="18"/>
+          <w:szCs w:val="18"/>
+        </w:rPr>
         <w:t xml:space="preserve">EDUCATION</w:t>
       </w:r>
     </w:p>
@@ -1156,11 +1343,7 @@
 </w:document>
 </file>
 
-<file path=word/comments.xml><?xml version="1.0" encoding="utf-8"?>
-<w:comments xmlns:cx="http://schemas.microsoft.com/office/drawing/2014/chartex" xmlns:cx1="http://schemas.microsoft.com/office/drawing/2015/9/8/chartex" xmlns:cx2="http://schemas.microsoft.com/office/drawing/2015/10/21/chartex" xmlns:cx3="http://schemas.microsoft.com/office/drawing/2016/5/9/chartex" xmlns:cx4="http://schemas.microsoft.com/office/drawing/2016/5/10/chartex" xmlns:cx5="http://schemas.microsoft.com/office/drawing/2016/5/11/chartex" xmlns:cx6="http://schemas.microsoft.com/office/drawing/2016/5/12/chartex" xmlns:cx7="http://schemas.microsoft.com/office/drawing/2016/5/13/chartex" xmlns:cx8="http://schemas.microsoft.com/office/drawing/2016/5/14/chartex" xmlns:mc="http://schemas.openxmlformats.org/markup-compatibility/2006" xmlns:aink="http://schemas.microsoft.com/office/drawing/2016/ink" xmlns:am3d="http://schemas.microsoft.com/office/drawing/2017/model3d" xmlns:o="urn:schemas-microsoft-com:office:office" xmlns:r="http://schemas.openxmlformats.org/officeDocument/2006/relationships" xmlns:m="http://schemas.openxmlformats.org/officeDocument/2006/math" xmlns:v="urn:schemas-microsoft-com:vml" xmlns:wp14="http://schemas.microsoft.com/office/word/2010/wordprocessingDrawing" xmlns:wp="http://schemas.openxmlformats.org/drawingml/2006/wordprocessingDrawing" xmlns:w10="urn:schemas-microsoft-com:office:word" xmlns:w="http://schemas.openxmlformats.org/wordprocessingml/2006/main" xmlns:w14="http://schemas.microsoft.com/office/word/2010/wordml" xmlns:w15="http://schemas.microsoft.com/office/word/2012/wordml" xmlns:w16cex="http://schemas.microsoft.com/office/word/2018/wordml/cex" xmlns:w16cid="http://schemas.microsoft.com/office/word/2016/wordml/cid" xmlns:w16="http://schemas.microsoft.com/office/word/2018/wordml" xmlns:w16sdtdh="http://schemas.microsoft.com/office/word/2020/wordml/sdtdatahash" xmlns:w16se="http://schemas.microsoft.com/office/word/2015/wordml/symex" xmlns:wpg="http://schemas.microsoft.com/office/word/2010/wordprocessingGroup" xmlns:wpi="http://schemas.microsoft.com/office/word/2010/wordprocessingInk" xmlns:wne="http://schemas.microsoft.com/office/word/2006/wordml" xmlns:wps="http://schemas.microsoft.com/office/word/2010/wordprocessingShape"/>
-</file>
-
-<file path=word/endnotes.xml><?xml version="1.0" encoding="utf-8"?>
+<file path=word\endnotes.xml><?xml version="1.0" encoding="utf-8"?>
 <w:endnotes xmlns:wpc="http://schemas.microsoft.com/office/word/2010/wordprocessingCanvas" xmlns:mc="http://schemas.openxmlformats.org/markup-compatibility/2006" xmlns:o="urn:schemas-microsoft-com:office:office" xmlns:r="http://schemas.openxmlformats.org/officeDocument/2006/relationships" xmlns:m="http://schemas.openxmlformats.org/officeDocument/2006/math" xmlns:v="urn:schemas-microsoft-com:vml" xmlns:wp14="http://schemas.microsoft.com/office/word/2010/wordprocessingDrawing" xmlns:wp="http://schemas.openxmlformats.org/drawingml/2006/wordprocessingDrawing" xmlns:w10="urn:schemas-microsoft-com:office:word" xmlns:w="http://schemas.openxmlformats.org/wordprocessingml/2006/main" xmlns:w14="http://schemas.microsoft.com/office/word/2010/wordml" xmlns:w15="http://schemas.microsoft.com/office/word/2012/wordml" xmlns:wpg="http://schemas.microsoft.com/office/word/2010/wordprocessingGroup" xmlns:wpi="http://schemas.microsoft.com/office/word/2010/wordprocessingInk" xmlns:wne="http://schemas.microsoft.com/office/word/2006/wordml" xmlns:wps="http://schemas.microsoft.com/office/word/2010/wordprocessingShape" mc:Ignorable="w14 w15 wp14">
   <w:endnote w:type="separator" w:id="-1">
     <w:p>
@@ -1197,7 +1380,11 @@
 </w:endnotes>
 </file>
 
-<file path=word/footnotes.xml><?xml version="1.0" encoding="utf-8"?>
+<file path=word\fontTable.xml><?xml version="1.0" encoding="utf-8"?>
+<w:fonts xmlns:mc="http://schemas.openxmlformats.org/markup-compatibility/2006" xmlns:r="http://schemas.openxmlformats.org/officeDocument/2006/relationships" xmlns:w="http://schemas.openxmlformats.org/wordprocessingml/2006/main" xmlns:w14="http://schemas.microsoft.com/office/word/2010/wordml" xmlns:w15="http://schemas.microsoft.com/office/word/2012/wordml" xmlns:w16cex="http://schemas.microsoft.com/office/word/2018/wordml/cex" xmlns:w16cid="http://schemas.microsoft.com/office/word/2016/wordml/cid" xmlns:w16="http://schemas.microsoft.com/office/word/2018/wordml" xmlns:w16sdtdh="http://schemas.microsoft.com/office/word/2020/wordml/sdtdatahash" xmlns:w16se="http://schemas.microsoft.com/office/word/2015/wordml/symex" mc:Ignorable="w14 w15 w16se w16cid w16 w16cex w16sdtdh"/>
+</file>
+
+<file path=word\footnotes.xml><?xml version="1.0" encoding="utf-8"?>
 <w:footnotes xmlns:wpc="http://schemas.microsoft.com/office/word/2010/wordprocessingCanvas" xmlns:mc="http://schemas.openxmlformats.org/markup-compatibility/2006" xmlns:o="urn:schemas-microsoft-com:office:office" xmlns:r="http://schemas.openxmlformats.org/officeDocument/2006/relationships" xmlns:m="http://schemas.openxmlformats.org/officeDocument/2006/math" xmlns:v="urn:schemas-microsoft-com:vml" xmlns:wp14="http://schemas.microsoft.com/office/word/2010/wordprocessingDrawing" xmlns:wp="http://schemas.openxmlformats.org/drawingml/2006/wordprocessingDrawing" xmlns:w10="urn:schemas-microsoft-com:office:word" xmlns:w="http://schemas.openxmlformats.org/wordprocessingml/2006/main" xmlns:w14="http://schemas.microsoft.com/office/word/2010/wordml" xmlns:w15="http://schemas.microsoft.com/office/word/2012/wordml" xmlns:wpg="http://schemas.microsoft.com/office/word/2010/wordprocessingGroup" xmlns:wpi="http://schemas.microsoft.com/office/word/2010/wordprocessingInk" xmlns:wne="http://schemas.microsoft.com/office/word/2006/wordml" xmlns:wps="http://schemas.microsoft.com/office/word/2010/wordprocessingShape" mc:Ignorable="w14 w15 wp14">
   <w:footnote w:type="separator" w:id="-1">
     <w:p>
@@ -1234,7 +1421,7 @@
 </w:footnotes>
 </file>
 
-<file path=word/numbering.xml><?xml version="1.0" encoding="utf-8"?>
+<file path=word\numbering.xml><?xml version="1.0" encoding="utf-8"?>
 <w:numbering xmlns:wpc="http://schemas.microsoft.com/office/word/2010/wordprocessingCanvas" xmlns:mc="http://schemas.openxmlformats.org/markup-compatibility/2006" xmlns:o="urn:schemas-microsoft-com:office:office" xmlns:r="http://schemas.openxmlformats.org/officeDocument/2006/relationships" xmlns:m="http://schemas.openxmlformats.org/officeDocument/2006/math" xmlns:v="urn:schemas-microsoft-com:vml" xmlns:wp14="http://schemas.microsoft.com/office/word/2010/wordprocessingDrawing" xmlns:wp="http://schemas.openxmlformats.org/drawingml/2006/wordprocessingDrawing" xmlns:w10="urn:schemas-microsoft-com:office:word" xmlns:w="http://schemas.openxmlformats.org/wordprocessingml/2006/main" xmlns:w14="http://schemas.microsoft.com/office/word/2010/wordml" xmlns:w15="http://schemas.microsoft.com/office/word/2012/wordml" xmlns:wpg="http://schemas.microsoft.com/office/word/2010/wordprocessingGroup" xmlns:wpi="http://schemas.microsoft.com/office/word/2010/wordprocessingInk" xmlns:wne="http://schemas.microsoft.com/office/word/2006/wordml" xmlns:wps="http://schemas.microsoft.com/office/word/2010/wordprocessingShape" mc:Ignorable="w14 w15 wp14">
   <w:abstractNum w:abstractNumId="1" w15:restartNumberingAfterBreak="0">
     <w:multiLevelType w:val="hybridMultilevel"/>
@@ -1353,7 +1540,17 @@
 </w:numbering>
 </file>
 
-<file path=word/styles.xml><?xml version="1.0" encoding="utf-8"?>
+<file path=word\settings.xml><?xml version="1.0" encoding="utf-8"?>
+<w:settings xmlns:wpc="http://schemas.microsoft.com/office/word/2010/wordprocessingCanvas" xmlns:mc="http://schemas.openxmlformats.org/markup-compatibility/2006" xmlns:o="urn:schemas-microsoft-com:office:office" xmlns:r="http://schemas.openxmlformats.org/officeDocument/2006/relationships" xmlns:m="http://schemas.openxmlformats.org/officeDocument/2006/math" xmlns:v="urn:schemas-microsoft-com:vml" xmlns:wp14="http://schemas.microsoft.com/office/word/2010/wordprocessingDrawing" xmlns:wp="http://schemas.openxmlformats.org/drawingml/2006/wordprocessingDrawing" xmlns:w10="urn:schemas-microsoft-com:office:word" xmlns:w="http://schemas.openxmlformats.org/wordprocessingml/2006/main" xmlns:w14="http://schemas.microsoft.com/office/word/2010/wordml" xmlns:w15="http://schemas.microsoft.com/office/word/2012/wordml" xmlns:wpg="http://schemas.microsoft.com/office/word/2010/wordprocessingGroup" xmlns:wpi="http://schemas.microsoft.com/office/word/2010/wordprocessingInk" xmlns:wne="http://schemas.microsoft.com/office/word/2006/wordml" xmlns:wps="http://schemas.microsoft.com/office/word/2010/wordprocessingShape" mc:Ignorable="w14 w15 wp14">
+  <w:displayBackgroundShape/>
+  <w:evenAndOddHeaders w:val="false"/>
+  <w:compat>
+    <w:compatSetting w:val="15" w:name="compatibilityMode" w:uri="http://schemas.microsoft.com/office/word"/>
+  </w:compat>
+</w:settings>
+</file>
+
+<file path=word\styles.xml><?xml version="1.0" encoding="utf-8"?>
 <w:styles xmlns:mc="http://schemas.openxmlformats.org/markup-compatibility/2006" xmlns:r="http://schemas.openxmlformats.org/officeDocument/2006/relationships" xmlns:w="http://schemas.openxmlformats.org/wordprocessingml/2006/main" xmlns:w14="http://schemas.microsoft.com/office/word/2010/wordml" xmlns:w15="http://schemas.microsoft.com/office/word/2012/wordml" mc:Ignorable="w14 w15">
   <w:docDefaults>
     <w:rPrDefault/>

</xml_diff>